<commit_message>
Update application logic and document template
Replit-Commit-Author: Agent
</commit_message>
<xml_diff>
--- a/templates/working/Доверенность_ПНД.docx
+++ b/templates/working/Доверенность_ПНД.docx
@@ -151,49 +151,7 @@
           <w:szCs w:val="28"/>
           <w:lang w:val="ru-RU"/>
         </w:rPr>
-        <w:t>Я, {{</w:t>
-      </w:r>
-      <w:r>
-        <w:rPr>
-          <w:rFonts w:ascii="Times New Roman" w:hAnsi="Times New Roman" w:cs="Times New Roman"/>
-          <w:sz w:val="28"/>
-          <w:szCs w:val="28"/>
-        </w:rPr>
-        <w:t>seller</w:t>
-      </w:r>
-      <w:r>
-        <w:rPr>
-          <w:rFonts w:ascii="Times New Roman" w:hAnsi="Times New Roman" w:cs="Times New Roman"/>
-          <w:sz w:val="28"/>
-          <w:szCs w:val="28"/>
-          <w:lang w:val="ru-RU"/>
-        </w:rPr>
-        <w:t>.</w:t>
-      </w:r>
-      <w:r>
-        <w:rPr>
-          <w:rFonts w:ascii="Times New Roman" w:hAnsi="Times New Roman" w:cs="Times New Roman"/>
-          <w:sz w:val="28"/>
-          <w:szCs w:val="28"/>
-        </w:rPr>
-        <w:t>f</w:t>
-      </w:r>
-      <w:r>
-        <w:rPr>
-          <w:rFonts w:ascii="Times New Roman" w:hAnsi="Times New Roman" w:cs="Times New Roman"/>
-          <w:sz w:val="28"/>
-          <w:szCs w:val="28"/>
-        </w:rPr>
-        <w:t>ullName</w:t>
-      </w:r>
-      <w:r>
-        <w:rPr>
-          <w:rFonts w:ascii="Times New Roman" w:hAnsi="Times New Roman" w:cs="Times New Roman"/>
-          <w:sz w:val="28"/>
-          <w:szCs w:val="28"/>
-          <w:lang w:val="ru-RU"/>
-        </w:rPr>
-        <w:t>}}</w:t>
+        <w:t>Я, {{person.fullName}}</w:t>
       </w:r>
     </w:p>
     <w:p>
@@ -216,49 +174,7 @@
           <w:szCs w:val="28"/>
           <w:lang w:val="ru-RU"/>
         </w:rPr>
-        <w:t>Дата рождения: {{</w:t>
-      </w:r>
-      <w:r>
-        <w:rPr>
-          <w:rFonts w:ascii="Times New Roman" w:hAnsi="Times New Roman" w:cs="Times New Roman"/>
-          <w:sz w:val="28"/>
-          <w:szCs w:val="28"/>
-        </w:rPr>
-        <w:t>seller</w:t>
-      </w:r>
-      <w:r>
-        <w:rPr>
-          <w:rFonts w:ascii="Times New Roman" w:hAnsi="Times New Roman" w:cs="Times New Roman"/>
-          <w:sz w:val="28"/>
-          <w:szCs w:val="28"/>
-          <w:lang w:val="ru-RU"/>
-        </w:rPr>
-        <w:t>.</w:t>
-      </w:r>
-      <w:r>
-        <w:rPr>
-          <w:rFonts w:ascii="Times New Roman" w:hAnsi="Times New Roman" w:cs="Times New Roman"/>
-          <w:sz w:val="28"/>
-          <w:szCs w:val="28"/>
-        </w:rPr>
-        <w:t>b</w:t>
-      </w:r>
-      <w:r>
-        <w:rPr>
-          <w:rFonts w:ascii="Times New Roman" w:hAnsi="Times New Roman" w:cs="Times New Roman"/>
-          <w:sz w:val="28"/>
-          <w:szCs w:val="28"/>
-        </w:rPr>
-        <w:t>irthDate</w:t>
-      </w:r>
-      <w:r>
-        <w:rPr>
-          <w:rFonts w:ascii="Times New Roman" w:hAnsi="Times New Roman" w:cs="Times New Roman"/>
-          <w:sz w:val="28"/>
-          <w:szCs w:val="28"/>
-          <w:lang w:val="ru-RU"/>
-        </w:rPr>
-        <w:t>}}</w:t>
+        <w:t>Дата рождения: {{person.birthDate}}</w:t>
       </w:r>
     </w:p>
     <w:p>
@@ -281,49 +197,7 @@
           <w:szCs w:val="28"/>
           <w:lang w:val="ru-RU"/>
         </w:rPr>
-        <w:t>Адрес регистрации: {{</w:t>
-      </w:r>
-      <w:r>
-        <w:rPr>
-          <w:rFonts w:ascii="Times New Roman" w:hAnsi="Times New Roman" w:cs="Times New Roman"/>
-          <w:sz w:val="28"/>
-          <w:szCs w:val="28"/>
-        </w:rPr>
-        <w:t>seller</w:t>
-      </w:r>
-      <w:r>
-        <w:rPr>
-          <w:rFonts w:ascii="Times New Roman" w:hAnsi="Times New Roman" w:cs="Times New Roman"/>
-          <w:sz w:val="28"/>
-          <w:szCs w:val="28"/>
-          <w:lang w:val="ru-RU"/>
-        </w:rPr>
-        <w:t>.</w:t>
-      </w:r>
-      <w:r>
-        <w:rPr>
-          <w:rFonts w:ascii="Times New Roman" w:hAnsi="Times New Roman" w:cs="Times New Roman"/>
-          <w:sz w:val="28"/>
-          <w:szCs w:val="28"/>
-        </w:rPr>
-        <w:t>a</w:t>
-      </w:r>
-      <w:r>
-        <w:rPr>
-          <w:rFonts w:ascii="Times New Roman" w:hAnsi="Times New Roman" w:cs="Times New Roman"/>
-          <w:sz w:val="28"/>
-          <w:szCs w:val="28"/>
-        </w:rPr>
-        <w:t>ddress</w:t>
-      </w:r>
-      <w:r>
-        <w:rPr>
-          <w:rFonts w:ascii="Times New Roman" w:hAnsi="Times New Roman" w:cs="Times New Roman"/>
-          <w:sz w:val="28"/>
-          <w:szCs w:val="28"/>
-          <w:lang w:val="ru-RU"/>
-        </w:rPr>
-        <w:t>}}</w:t>
+        <w:t>Адрес регистрации: {{person.address}}</w:t>
       </w:r>
     </w:p>
     <w:p>
@@ -346,49 +220,7 @@
           <w:szCs w:val="28"/>
           <w:lang w:val="ru-RU"/>
         </w:rPr>
-        <w:t>Идентификационный номер {{</w:t>
-      </w:r>
-      <w:r>
-        <w:rPr>
-          <w:rFonts w:ascii="Times New Roman" w:hAnsi="Times New Roman" w:cs="Times New Roman"/>
-          <w:sz w:val="28"/>
-          <w:szCs w:val="28"/>
-        </w:rPr>
-        <w:t>seller</w:t>
-      </w:r>
-      <w:r>
-        <w:rPr>
-          <w:rFonts w:ascii="Times New Roman" w:hAnsi="Times New Roman" w:cs="Times New Roman"/>
-          <w:sz w:val="28"/>
-          <w:szCs w:val="28"/>
-          <w:lang w:val="ru-RU"/>
-        </w:rPr>
-        <w:t>.</w:t>
-      </w:r>
-      <w:r>
-        <w:rPr>
-          <w:rFonts w:ascii="Times New Roman" w:hAnsi="Times New Roman" w:cs="Times New Roman"/>
-          <w:sz w:val="28"/>
-          <w:szCs w:val="28"/>
-        </w:rPr>
-        <w:t>i</w:t>
-      </w:r>
-      <w:r>
-        <w:rPr>
-          <w:rFonts w:ascii="Times New Roman" w:hAnsi="Times New Roman" w:cs="Times New Roman"/>
-          <w:sz w:val="28"/>
-          <w:szCs w:val="28"/>
-        </w:rPr>
-        <w:t>d</w:t>
-      </w:r>
-      <w:r>
-        <w:rPr>
-          <w:rFonts w:ascii="Times New Roman" w:hAnsi="Times New Roman" w:cs="Times New Roman"/>
-          <w:sz w:val="28"/>
-          <w:szCs w:val="28"/>
-          <w:lang w:val="ru-RU"/>
-        </w:rPr>
-        <w:t>}}</w:t>
+        <w:t>Идентификационный номер {{person.id}}</w:t>
       </w:r>
     </w:p>
     <w:p>
@@ -529,83 +361,7 @@
           <w:szCs w:val="28"/>
           <w:lang w:val="ru-RU"/>
         </w:rPr>
-        <w:t>________________ / {{</w:t>
-      </w:r>
-      <w:r>
-        <w:rPr>
-          <w:rFonts w:ascii="Times New Roman" w:hAnsi="Times New Roman" w:cs="Times New Roman"/>
-          <w:sz w:val="28"/>
-          <w:szCs w:val="28"/>
-        </w:rPr>
-        <w:t>seller</w:t>
-      </w:r>
-      <w:r>
-        <w:rPr>
-          <w:rFonts w:ascii="Times New Roman" w:hAnsi="Times New Roman" w:cs="Times New Roman"/>
-          <w:sz w:val="28"/>
-          <w:szCs w:val="28"/>
-          <w:lang w:val="ru-RU"/>
-        </w:rPr>
-        <w:t>.</w:t>
-      </w:r>
-      <w:r>
-        <w:rPr>
-          <w:rFonts w:ascii="Times New Roman" w:hAnsi="Times New Roman" w:cs="Times New Roman"/>
-          <w:sz w:val="28"/>
-          <w:szCs w:val="28"/>
-        </w:rPr>
-        <w:t>f</w:t>
-      </w:r>
-      <w:r>
-        <w:rPr>
-          <w:rFonts w:ascii="Times New Roman" w:hAnsi="Times New Roman" w:cs="Times New Roman"/>
-          <w:sz w:val="28"/>
-          <w:szCs w:val="28"/>
-        </w:rPr>
-        <w:t>ullName</w:t>
-      </w:r>
-      <w:r>
-        <w:rPr>
-          <w:rFonts w:ascii="Times New Roman" w:hAnsi="Times New Roman" w:cs="Times New Roman"/>
-          <w:sz w:val="28"/>
-          <w:szCs w:val="28"/>
-          <w:lang w:val="ru-RU"/>
-        </w:rPr>
-        <w:t>}}      {{</w:t>
-      </w:r>
-      <w:r>
-        <w:rPr>
-          <w:rFonts w:ascii="Times New Roman" w:hAnsi="Times New Roman" w:cs="Times New Roman"/>
-          <w:sz w:val="28"/>
-          <w:szCs w:val="28"/>
-        </w:rPr>
-        <w:t>deal</w:t>
-      </w:r>
-      <w:r>
-        <w:rPr>
-          <w:rFonts w:ascii="Times New Roman" w:hAnsi="Times New Roman" w:cs="Times New Roman"/>
-          <w:sz w:val="28"/>
-          <w:szCs w:val="28"/>
-          <w:lang w:val="ru-RU"/>
-        </w:rPr>
-        <w:t>.</w:t>
-      </w:r>
-      <w:r>
-        <w:rPr>
-          <w:rFonts w:ascii="Times New Roman" w:hAnsi="Times New Roman" w:cs="Times New Roman"/>
-          <w:sz w:val="28"/>
-          <w:szCs w:val="28"/>
-        </w:rPr>
-        <w:t>date</w:t>
-      </w:r>
-      <w:r>
-        <w:rPr>
-          <w:rFonts w:ascii="Times New Roman" w:hAnsi="Times New Roman" w:cs="Times New Roman"/>
-          <w:sz w:val="28"/>
-          <w:szCs w:val="28"/>
-          <w:lang w:val="ru-RU"/>
-        </w:rPr>
-        <w:t>}}</w:t>
+        <w:t xml:space="preserve">________________ / {{person.signatoryLabel}}      {{deal.date}}</w:t>
       </w:r>
     </w:p>
     <w:p>

</xml_diff>